<commit_message>
docs: reintegrate week 4 deliverables
</commit_message>
<xml_diff>
--- a/docs/week4/reports/向量存储与检索模块API文档.docx
+++ b/docs/week4/reports/向量存储与检索模块API文档.docx
@@ -5012,7 +5012,7 @@
           <w:color w:val="000000"/>
           <w:sz w:val="32"/>
         </w:rPr>
-        <w:t>8. 验收与追溯</w:t>
+        <w:t>8. 验收结果</w:t>
       </w:r>
     </w:p>
     <w:p>
@@ -5562,7 +5562,7 @@
                 <w:color w:val="000000"/>
                 <w:sz w:val="19"/>
               </w:rPr>
-              <w:t>337 passed</w:t>
+              <w:t>整改提交 337 passed；原始提交 162 passed</w:t>
             </w:r>
           </w:p>
         </w:tc>
@@ -5694,31 +5694,6 @@
       <w:pPr>
         <w:spacing w:before="0" w:after="80"/>
       </w:pPr>
-    </w:p>
-    <w:p>
-      <w:pPr>
-        <w:spacing w:line="300" w:lineRule="auto" w:after="120"/>
-      </w:pPr>
-      <w:r>
-        <w:rPr>
-          <w:rFonts w:ascii="Times New Roman" w:hAnsi="Times New Roman" w:eastAsia="Times New Roman" w:cs="Times New Roman"/>
-          <w:b/>
-          <w:i w:val="0"/>
-          <w:color w:val="000000"/>
-          <w:sz w:val="22"/>
-        </w:rPr>
-        <w:t>证据文件:</w:t>
-      </w:r>
-      <w:r>
-        <w:rPr>
-          <w:rFonts w:ascii="Times New Roman" w:hAnsi="Times New Roman" w:eastAsia="Times New Roman" w:cs="Times New Roman"/>
-          <w:b w:val="0"/>
-          <w:i/>
-          <w:color w:val="000000"/>
-          <w:sz w:val="22"/>
-        </w:rPr>
-        <w:t xml:space="preserve"> e2e-summary.json；retrieval-benchmark-summary.json；performance-summary.json；week4-coverage.json。</w:t>
-      </w:r>
     </w:p>
     <w:sectPr>
       <w:headerReference w:type="default" r:id="rId9"/>

</xml_diff>

<commit_message>
docs: finalize week 4 reintegration evidence
</commit_message>
<xml_diff>
--- a/docs/week4/reports/向量存储与检索模块API文档.docx
+++ b/docs/week4/reports/向量存储与检索模块API文档.docx
@@ -5562,7 +5562,7 @@
                 <w:color w:val="000000"/>
                 <w:sz w:val="19"/>
               </w:rPr>
-              <w:t>整改提交 337 passed；原始提交 162 passed</w:t>
+              <w:t>重新整合提交 340 passed；整改提交 337 passed；原始提交 162 passed</w:t>
             </w:r>
           </w:p>
         </w:tc>
@@ -5654,7 +5654,7 @@
                 <w:color w:val="000000"/>
                 <w:sz w:val="19"/>
               </w:rPr>
-              <w:t>87.91%，门槛 85%</w:t>
+              <w:t>88.08%，门槛 85%</w:t>
             </w:r>
           </w:p>
         </w:tc>

</xml_diff>